<commit_message>
v1.2: curveballs step, curveball checklist, arrow-key nav, scrolling ledger
</commit_message>
<xml_diff>
--- a/docs/Flight-Recorder-User-Guide.docx
+++ b/docs/Flight-Recorder-User-Guide.docx
@@ -12,7 +12,7 @@
     </w:p>
     <w:p>
       <w:r>
-        <w:t>A free, offline walkthrough of a governed AI workflow for insurance. Version 1.1, October 12, 2026. Author: Nathan Platter.</w:t>
+        <w:t>A free, offline walkthrough of a governed AI workflow for insurance. Version 1.2, October 12, 2026. Author: Nathan Platter.</w:t>
       </w:r>
     </w:p>
     <w:p>
@@ -79,6 +79,14 @@
       </w:pPr>
       <w:r>
         <w:t>Watchlist: three scenario cards (state market exit, reinsurance territory gap, impersonation signals across a series of claims) where the system suspects something, gives reason codes, and routes to a named person. It never decides and never declares fraud.</w:t>
+      </w:r>
+    </w:p>
+    <w:p>
+      <w:pPr>
+        <w:pStyle w:val="ListNumber"/>
+      </w:pPr>
+      <w:r>
+        <w:t>Curveballs: nine traps that fool both a QC check and a careful reviewer (handwriting OCR, amounts stored as text, rounding drift, a stale privacy notice, a time-zone cutoff, units in thousands, a look-alike name, an ambiguous date, an expired producer license). Each shows the naive result, the guardrail result, what would have gone wrong, an estimated impact, a reason code, and a named reviewer.</w:t>
       </w:r>
     </w:p>
     <w:p>
@@ -259,7 +267,7 @@
     </w:p>
     <w:p>
       <w:r>
-        <w:t>Tips: add #step1 through #step7 to the address to jump to a step (earlier steps run automatically). Reset demo starts over. The ledger on the right records everything in order.</w:t>
+        <w:t>Tips: add #step1 through #step8 to the address to jump to a step (earlier steps run automatically). Reset demo starts over. Left and right arrow keys move between steps. The ledger on the right records everything in order.</w:t>
       </w:r>
     </w:p>
     <w:p>
@@ -434,7 +442,7 @@
       <w:r>
         <w:drawing>
           <wp:inline xmlns:a="http://schemas.openxmlformats.org/drawingml/2006/main" xmlns:pic="http://schemas.openxmlformats.org/drawingml/2006/picture">
-            <wp:extent cx="5760720" cy="7020878"/>
+            <wp:extent cx="5760720" cy="4528566"/>
             <wp:docPr id="4" name="Picture 4"/>
             <wp:cNvGraphicFramePr>
               <a:graphicFrameLocks noChangeAspect="1"/>
@@ -455,7 +463,7 @@
                   <pic:spPr>
                     <a:xfrm>
                       <a:off x="0" y="0"/>
-                      <a:ext cx="5760720" cy="7020878"/>
+                      <a:ext cx="5760720" cy="4528566"/>
                     </a:xfrm>
                     <a:prstGeom prst="rect"/>
                   </pic:spPr>
@@ -483,7 +491,7 @@
       <w:r>
         <w:drawing>
           <wp:inline xmlns:a="http://schemas.openxmlformats.org/drawingml/2006/main" xmlns:pic="http://schemas.openxmlformats.org/drawingml/2006/picture">
-            <wp:extent cx="5760720" cy="8809101"/>
+            <wp:extent cx="5760720" cy="4336542"/>
             <wp:docPr id="5" name="Picture 5"/>
             <wp:cNvGraphicFramePr>
               <a:graphicFrameLocks noChangeAspect="1"/>
@@ -504,7 +512,7 @@
                   <pic:spPr>
                     <a:xfrm>
                       <a:off x="0" y="0"/>
-                      <a:ext cx="5760720" cy="8809101"/>
+                      <a:ext cx="5760720" cy="4336542"/>
                     </a:xfrm>
                     <a:prstGeom prst="rect"/>
                   </pic:spPr>
@@ -532,7 +540,7 @@
       <w:r>
         <w:drawing>
           <wp:inline xmlns:a="http://schemas.openxmlformats.org/drawingml/2006/main" xmlns:pic="http://schemas.openxmlformats.org/drawingml/2006/picture">
-            <wp:extent cx="5760720" cy="12233529"/>
+            <wp:extent cx="5760720" cy="4980622"/>
             <wp:docPr id="6" name="Picture 6"/>
             <wp:cNvGraphicFramePr>
               <a:graphicFrameLocks noChangeAspect="1"/>
@@ -553,7 +561,56 @@
                   <pic:spPr>
                     <a:xfrm>
                       <a:off x="0" y="0"/>
-                      <a:ext cx="5760720" cy="12233529"/>
+                      <a:ext cx="5760720" cy="4980622"/>
+                    </a:xfrm>
+                    <a:prstGeom prst="rect"/>
+                  </pic:spPr>
+                </pic:pic>
+              </a:graphicData>
+            </a:graphic>
+          </wp:inline>
+        </w:drawing>
+      </w:r>
+    </w:p>
+    <w:p>
+      <w:pPr>
+        <w:pStyle w:val="Heading2"/>
+      </w:pPr>
+      <w:r>
+        <w:t>Step 7. Curveballs</w:t>
+      </w:r>
+    </w:p>
+    <w:p>
+      <w:r>
+        <w:t>Each card shows four things in plain English: what a naive check concluded (red), what the guardrail caught (green), what would have gone wrong, and the impact, always labeled as an estimate. 1. Handwriting (OCR_LOW_CONFIDENCE): a synthetic margin note reads $1,500 at 0.58 confidence against a typed $7,500; a Claims Adjuster reads the original. 2. Amounts as text (TYPE_COERCION): "12,500.00" vs "12.500,00", "1.25E4", and a trailing space all fail a string compare, and parseFloat turns 12.500,00 into 12.5; policy 00047213 loses its zeros as a number. 3. Rounding drift (PRECISION_DRIFT): $0.125 rounded on each of 2,000 lines is $10 off the exact total. 4. Stale privacy notice (STALE_COMPLIANCE_DOC): search ranks the 2023 edition first; the effective-date check holds it and shows 2025. 5. Time-zone cutoff (TIMEZONE_BIND): a loss logged as 07/01 04:58 UTC is 11:58 PM on 06/30 in Central, before 12:01 AM inception. 6. Units (UNIT_MISMATCH): a treaty schedule in thousands. 7. Look-alike name (HOMOGLYPH_DUPLICATE): Jon Mіller uses a Cyrillic letter; Unicode confusable normalization (TR39) matches John Miller. 8. Date format (DATE_FORMAT_AMBIGUOUS): 03/04 from an EU-locale portal. 9. Producer license (PRODUCER_LICENSE_LAPSED): expired two days before binding. Click each spot-check button, or use the presenter shortcut. Maps to NAIC AIS Program Guidelines 3.2 and 3.4.</w:t>
+      </w:r>
+    </w:p>
+    <w:p>
+      <w:r>
+        <w:drawing>
+          <wp:inline xmlns:a="http://schemas.openxmlformats.org/drawingml/2006/main" xmlns:pic="http://schemas.openxmlformats.org/drawingml/2006/picture">
+            <wp:extent cx="5760720" cy="8461058"/>
+            <wp:docPr id="7" name="Picture 7"/>
+            <wp:cNvGraphicFramePr>
+              <a:graphicFrameLocks noChangeAspect="1"/>
+            </wp:cNvGraphicFramePr>
+            <a:graphic>
+              <a:graphicData uri="http://schemas.openxmlformats.org/drawingml/2006/picture">
+                <pic:pic>
+                  <pic:nvPicPr>
+                    <pic:cNvPr id="0" name="step7.png"/>
+                    <pic:cNvPicPr/>
+                  </pic:nvPicPr>
+                  <pic:blipFill>
+                    <a:blip r:embed="rId15"/>
+                    <a:stretch>
+                      <a:fillRect/>
+                    </a:stretch>
+                  </pic:blipFill>
+                  <pic:spPr>
+                    <a:xfrm>
+                      <a:off x="0" y="0"/>
+                      <a:ext cx="5760720" cy="8461058"/>
                     </a:xfrm>
                     <a:prstGeom prst="rect"/>
                   </pic:spPr>
@@ -581,8 +638,8 @@
       <w:r>
         <w:drawing>
           <wp:inline xmlns:a="http://schemas.openxmlformats.org/drawingml/2006/main" xmlns:pic="http://schemas.openxmlformats.org/drawingml/2006/picture">
-            <wp:extent cx="5760720" cy="12613576"/>
-            <wp:docPr id="7" name="Picture 7"/>
+            <wp:extent cx="5760720" cy="24043005"/>
+            <wp:docPr id="8" name="Picture 8"/>
             <wp:cNvGraphicFramePr>
               <a:graphicFrameLocks noChangeAspect="1"/>
             </wp:cNvGraphicFramePr>
@@ -590,11 +647,11 @@
               <a:graphicData uri="http://schemas.openxmlformats.org/drawingml/2006/picture">
                 <pic:pic>
                   <pic:nvPicPr>
-                    <pic:cNvPr id="0" name="step7.png"/>
+                    <pic:cNvPr id="0" name="step8.png"/>
                     <pic:cNvPicPr/>
                   </pic:nvPicPr>
                   <pic:blipFill>
-                    <a:blip r:embed="rId15"/>
+                    <a:blip r:embed="rId16"/>
                     <a:stretch>
                       <a:fillRect/>
                     </a:stretch>
@@ -602,7 +659,7 @@
                   <pic:spPr>
                     <a:xfrm>
                       <a:off x="0" y="0"/>
-                      <a:ext cx="5760720" cy="12613576"/>
+                      <a:ext cx="5760720" cy="24043005"/>
                     </a:xfrm>
                     <a:prstGeom prst="rect"/>
                   </pic:spPr>
@@ -672,6 +729,14 @@
       </w:pPr>
       <w:r>
         <w:t>SCEN: the watchlist cards. Each has a title, file, list of signals, the named role it routes to, a reason code, and the section reference. Keep the rule: the system suspects, a person decides.</w:t>
+      </w:r>
+    </w:p>
+    <w:p>
+      <w:pPr>
+        <w:pStyle w:val="ListBullet"/>
+      </w:pPr>
+      <w:r>
+        <w:t>CB: the curveballs. Each has an id, title, reason code, route, the plain-English wrong and impact text, and a run() function that performs the real check. Edit the inputs inside run() to try your own messy data.</w:t>
       </w:r>
     </w:p>
     <w:p>
@@ -761,6 +826,14 @@
         <w:pStyle w:val="ListBullet"/>
       </w:pPr>
       <w:r>
+        <w:t>Handwriting looks different on your machine: the note uses whatever script-style font your computer has (Segoe Script on Windows, Bradley Hand on Mac). The ambiguity is the point, not the font.</w:t>
+      </w:r>
+    </w:p>
+    <w:p>
+      <w:pPr>
+        <w:pStyle w:val="ListBullet"/>
+      </w:pPr>
+      <w:r>
         <w:t>Projector cuts off the ledger: zoom out with Command+minus (Mac) or Control+minus (Windows). Below 900 pixels wide, the ledger moves under the main panel.</w:t>
       </w:r>
     </w:p>
@@ -774,7 +847,7 @@
     </w:p>
     <w:p>
       <w:r>
-        <w:t>All seven screens, the source click, both holds, the supervisor decision, all three watchlist spot-checks, and the evidence-pack download were run automatically in browser engines set up to imitate Safari on Mac (1440x900 and 1280x800), Edge on Windows (1920x1080 and 1366x768), and Firefox, from both a local file and a local server, plus the GitHub Pages copy. This is emulation, not real Mac or Windows hardware. See TEST-REPORT.md.</w:t>
+        <w:t>All seven screens, the source click, both holds, the supervisor decision, all three watchlist spot-checks, all nine curveball spot-checks, arrow-key navigation, and the evidence-pack download were run automatically in browser engines set up to imitate Safari on Mac (1440x900 and 1280x800), Edge on Windows (1920x1080 and 1366x768), and Firefox, from both a local file and a local server, plus the GitHub Pages copy. This is emulation, not real Mac or Windows hardware. See TEST-REPORT.md.</w:t>
       </w:r>
     </w:p>
     <w:p>
@@ -791,6 +864,14 @@
       </w:pPr>
       <w:r>
         <w:t>takehomes/permission-card-template.md: a one-page card to fill out before any agent touches production.</w:t>
+      </w:r>
+    </w:p>
+    <w:p>
+      <w:pPr>
+        <w:pStyle w:val="ListBullet"/>
+      </w:pPr>
+      <w:r>
+        <w:t>takehomes/curveball-checklist.md: the nine traps as questions with the guardrail for each.</w:t>
       </w:r>
     </w:p>
     <w:p>
@@ -822,6 +903,11 @@
     <w:p>
       <w:r>
         <w:t>Verisk, State of Insurance Fraud study: https://www.verisk.com/49411b/siteassets/media/campaigns/gated/claims/verisk-state-of-insurance-fraud-study.pdf</w:t>
+      </w:r>
+    </w:p>
+    <w:p>
+      <w:r>
+        <w:t>Unicode Technical Standard #39, Unicode Security Mechanisms: https://www.unicode.org/reports/tr39/</w:t>
       </w:r>
     </w:p>
     <w:p>

</xml_diff>